<commit_message>
hasta 3 - Clases de Estilo
</commit_message>
<xml_diff>
--- a/resumen.docx
+++ b/resumen.docx
@@ -18,7 +18,14 @@
           <w:b/>
           <w:bCs/>
         </w:rPr>
-        <w:t>Dia 01</w:t>
+        <w:t xml:space="preserve">Dia 01 </w:t>
+      </w:r>
+      <w:r>
+        <w:rPr>
+          <w:b/>
+          <w:bCs/>
+        </w:rPr>
+        <w:t>HTML</w:t>
       </w:r>
     </w:p>
     <w:p>
@@ -226,65 +233,9 @@
         <w:jc w:val="left"/>
         <w:rPr/>
       </w:pPr>
-      <w:hyperlink r:id="rId3">
-        <w:r>
-          <w:rPr>
-            <w:rStyle w:val="Hyperlink"/>
-            <w:rFonts w:ascii="Udemy Sans;Noto Sans JP;Vazirmatn;SF Pro Text;apple-system;blinkmacsystemfont;roboto;Segoe UI;helvetica;arial;sans-serif;Apple Color Emoji;Segoe UI Emoji;Segoe UI Symbol" w:hAnsi="Udemy Sans;Noto Sans JP;Vazirmatn;SF Pro Text;apple-system;blinkmacsystemfont;roboto;Segoe UI;helvetica;arial;sans-serif;Apple Color Emoji;Segoe UI Emoji;Segoe UI Symbol"/>
-            <w:b w:val="false"/>
-            <w:i w:val="false"/>
-            <w:caps w:val="false"/>
-            <w:smallCaps w:val="false"/>
-            <w:spacing w:val="0"/>
-            <w:sz w:val="21"/>
-            <w:u w:val="none"/>
-          </w:rPr>
-          <w:t>https://ascii.cl/es/codigos-html.htm</w:t>
-        </w:r>
-      </w:hyperlink>
-    </w:p>
-    <w:p>
-      <w:pPr>
-        <w:pStyle w:val="Normal"/>
-        <w:numPr>
-          <w:ilvl w:val="0"/>
-          <w:numId w:val="0"/>
-        </w:numPr>
-        <w:bidi w:val="0"/>
-        <w:spacing w:lineRule="auto" w:line="360" w:before="57" w:after="57"/>
-        <w:ind w:hanging="0" w:left="960"/>
-        <w:jc w:val="left"/>
-        <w:rPr/>
-      </w:pPr>
-      <w:hyperlink r:id="rId5">
-        <w:r>
-          <w:rPr>
-            <w:rStyle w:val="Hyperlink"/>
-            <w:rFonts w:ascii="Udemy Sans;Noto Sans JP;Vazirmatn;SF Pro Text;apple-system;blinkmacsystemfont;roboto;Segoe UI;helvetica;arial;sans-serif;Apple Color Emoji;Segoe UI Emoji;Segoe UI Symbol" w:hAnsi="Udemy Sans;Noto Sans JP;Vazirmatn;SF Pro Text;apple-system;blinkmacsystemfont;roboto;Segoe UI;helvetica;arial;sans-serif;Apple Color Emoji;Segoe UI Emoji;Segoe UI Symbol"/>
-            <w:b w:val="false"/>
-            <w:i w:val="false"/>
-            <w:caps w:val="false"/>
-            <w:smallCaps w:val="false"/>
-            <w:spacing w:val="0"/>
-            <w:sz w:val="21"/>
-            <w:u w:val="none"/>
-          </w:rPr>
-          <w:t>https://www.quackit.com/character_sets/emoji/emoji_v3.0/unicode_emoji_v3.0_characters_all.cfm</w:t>
-        </w:r>
-      </w:hyperlink>
-    </w:p>
-    <w:p>
-      <w:pPr>
-        <w:pStyle w:val="Normal"/>
-        <w:numPr>
-          <w:ilvl w:val="0"/>
-          <w:numId w:val="0"/>
-        </w:numPr>
-        <w:bidi w:val="0"/>
-        <w:spacing w:lineRule="auto" w:line="360" w:before="57" w:after="57"/>
-        <w:ind w:hanging="0" w:left="960"/>
-        <w:jc w:val="left"/>
-        <w:rPr>
+      <w:r>
+        <w:rPr>
+          <w:rStyle w:val="Hyperlink"/>
           <w:rFonts w:ascii="Udemy Sans;Noto Sans JP;Vazirmatn;SF Pro Text;apple-system;blinkmacsystemfont;roboto;Segoe UI;helvetica;arial;sans-serif;Apple Color Emoji;Segoe UI Emoji;Segoe UI Symbol" w:hAnsi="Udemy Sans;Noto Sans JP;Vazirmatn;SF Pro Text;apple-system;blinkmacsystemfont;roboto;Segoe UI;helvetica;arial;sans-serif;Apple Color Emoji;Segoe UI Emoji;Segoe UI Symbol"/>
           <w:b w:val="false"/>
           <w:i w:val="false"/>
@@ -292,11 +243,70 @@
           <w:smallCaps w:val="false"/>
           <w:spacing w:val="0"/>
           <w:sz w:val="21"/>
-        </w:rPr>
-      </w:pPr>
-      <w:r>
-        <w:rPr>
-          <w:u w:val="none"/>
+          <w:u w:val="none"/>
+        </w:rPr>
+        <w:t>https://ascii.cl/es/codigos-html.htm</w:t>
+      </w:r>
+    </w:p>
+    <w:p>
+      <w:pPr>
+        <w:pStyle w:val="Normal"/>
+        <w:numPr>
+          <w:ilvl w:val="0"/>
+          <w:numId w:val="0"/>
+        </w:numPr>
+        <w:bidi w:val="0"/>
+        <w:spacing w:lineRule="auto" w:line="360" w:before="57" w:after="57"/>
+        <w:ind w:hanging="0" w:left="960"/>
+        <w:jc w:val="left"/>
+        <w:rPr/>
+      </w:pPr>
+      <w:r>
+        <w:rPr>
+          <w:rStyle w:val="Hyperlink"/>
+          <w:rFonts w:ascii="Udemy Sans;Noto Sans JP;Vazirmatn;SF Pro Text;apple-system;blinkmacsystemfont;roboto;Segoe UI;helvetica;arial;sans-serif;Apple Color Emoji;Segoe UI Emoji;Segoe UI Symbol" w:hAnsi="Udemy Sans;Noto Sans JP;Vazirmatn;SF Pro Text;apple-system;blinkmacsystemfont;roboto;Segoe UI;helvetica;arial;sans-serif;Apple Color Emoji;Segoe UI Emoji;Segoe UI Symbol"/>
+          <w:b w:val="false"/>
+          <w:i w:val="false"/>
+          <w:caps w:val="false"/>
+          <w:smallCaps w:val="false"/>
+          <w:spacing w:val="0"/>
+          <w:sz w:val="21"/>
+          <w:u w:val="none"/>
+        </w:rPr>
+        <w:t>https://www.quackit.com/character_sets/emoji/emoji_v3.0/unicode_emoji_v3.0_characters_all.cfm</w:t>
+      </w:r>
+    </w:p>
+    <w:p>
+      <w:pPr>
+        <w:pStyle w:val="Normal"/>
+        <w:numPr>
+          <w:ilvl w:val="0"/>
+          <w:numId w:val="0"/>
+        </w:numPr>
+        <w:bidi w:val="0"/>
+        <w:spacing w:lineRule="auto" w:line="360" w:before="57" w:after="57"/>
+        <w:ind w:hanging="0" w:left="960"/>
+        <w:jc w:val="left"/>
+        <w:rPr>
+          <w:rFonts w:ascii="Udemy Sans;Noto Sans JP;Vazirmatn;SF Pro Text;apple-system;blinkmacsystemfont;roboto;Segoe UI;helvetica;arial;sans-serif;Apple Color Emoji;Segoe UI Emoji;Segoe UI Symbol" w:hAnsi="Udemy Sans;Noto Sans JP;Vazirmatn;SF Pro Text;apple-system;blinkmacsystemfont;roboto;Segoe UI;helvetica;arial;sans-serif;Apple Color Emoji;Segoe UI Emoji;Segoe UI Symbol"/>
+          <w:b w:val="false"/>
+          <w:i w:val="false"/>
+          <w:i w:val="false"/>
+          <w:caps w:val="false"/>
+          <w:smallCaps w:val="false"/>
+          <w:spacing w:val="0"/>
+          <w:sz w:val="21"/>
+        </w:rPr>
+      </w:pPr>
+      <w:r>
+        <w:rPr>
+          <w:rFonts w:ascii="Udemy Sans;Noto Sans JP;Vazirmatn;SF Pro Text;apple-system;blinkmacsystemfont;roboto;Segoe UI;helvetica;arial;sans-serif;Apple Color Emoji;Segoe UI Emoji;Segoe UI Symbol" w:hAnsi="Udemy Sans;Noto Sans JP;Vazirmatn;SF Pro Text;apple-system;blinkmacsystemfont;roboto;Segoe UI;helvetica;arial;sans-serif;Apple Color Emoji;Segoe UI Emoji;Segoe UI Symbol"/>
+          <w:b w:val="false"/>
+          <w:i w:val="false"/>
+          <w:caps w:val="false"/>
+          <w:smallCaps w:val="false"/>
+          <w:spacing w:val="0"/>
+          <w:sz w:val="21"/>
         </w:rPr>
       </w:r>
     </w:p>
@@ -388,7 +398,7 @@
       </w:pPr>
       <w:r>
         <w:rPr>
-          <w:u w:val="single"/>
+          <w:u w:val="none"/>
         </w:rPr>
       </w:r>
     </w:p>
@@ -500,7 +510,281 @@
       </w:pPr>
       <w:r>
         <w:rPr>
-          <w:u w:val="single"/>
+          <w:u w:val="none"/>
+        </w:rPr>
+      </w:r>
+    </w:p>
+    <w:p>
+      <w:pPr>
+        <w:pStyle w:val="Normal"/>
+        <w:numPr>
+          <w:ilvl w:val="0"/>
+          <w:numId w:val="0"/>
+        </w:numPr>
+        <w:bidi w:val="0"/>
+        <w:spacing w:lineRule="auto" w:line="360" w:before="57" w:after="57"/>
+        <w:ind w:hanging="0" w:left="960"/>
+        <w:jc w:val="left"/>
+        <w:rPr>
+          <w:u w:val="none"/>
+        </w:rPr>
+      </w:pPr>
+      <w:r>
+        <w:rPr>
+          <w:u w:val="none"/>
+        </w:rPr>
+      </w:r>
+    </w:p>
+    <w:p>
+      <w:pPr>
+        <w:pStyle w:val="Normal"/>
+        <w:bidi w:val="0"/>
+        <w:spacing w:lineRule="auto" w:line="360" w:before="57" w:after="57"/>
+        <w:jc w:val="left"/>
+        <w:rPr>
+          <w:b/>
+          <w:bCs/>
+        </w:rPr>
+      </w:pPr>
+      <w:r>
+        <w:rPr>
+          <w:b/>
+          <w:bCs/>
+        </w:rPr>
+        <w:t>Dia 0</w:t>
+      </w:r>
+      <w:r>
+        <w:rPr>
+          <w:b/>
+          <w:bCs/>
+        </w:rPr>
+        <w:t>2 CSS3</w:t>
+      </w:r>
+    </w:p>
+    <w:p>
+      <w:pPr>
+        <w:pStyle w:val="Normal"/>
+        <w:numPr>
+          <w:ilvl w:val="0"/>
+          <w:numId w:val="2"/>
+        </w:numPr>
+        <w:bidi w:val="0"/>
+        <w:spacing w:lineRule="auto" w:line="360" w:before="57" w:after="57"/>
+        <w:jc w:val="left"/>
+        <w:rPr>
+          <w:u w:val="single"/>
+        </w:rPr>
+      </w:pPr>
+      <w:r>
+        <w:rPr>
+          <w:u w:val="single"/>
+        </w:rPr>
+        <w:t>Estilos de texto</w:t>
+      </w:r>
+    </w:p>
+    <w:p>
+      <w:pPr>
+        <w:pStyle w:val="Normal"/>
+        <w:numPr>
+          <w:ilvl w:val="0"/>
+          <w:numId w:val="0"/>
+        </w:numPr>
+        <w:bidi w:val="0"/>
+        <w:spacing w:lineRule="auto" w:line="360" w:before="57" w:after="57"/>
+        <w:ind w:hanging="0" w:left="720"/>
+        <w:jc w:val="left"/>
+        <w:rPr/>
+      </w:pPr>
+      <w:r>
+        <w:rPr/>
+        <w:t>&lt;p style="margin: 20px; border: 10px; border-style: solid; border-color: blue;        padding: 60px;  width:200px"&gt; Este es mi texto&lt;/p&gt;</w:t>
+      </w:r>
+    </w:p>
+    <w:p>
+      <w:pPr>
+        <w:pStyle w:val="Normal"/>
+        <w:numPr>
+          <w:ilvl w:val="0"/>
+          <w:numId w:val="0"/>
+        </w:numPr>
+        <w:bidi w:val="0"/>
+        <w:spacing w:lineRule="auto" w:line="360" w:before="57" w:after="57"/>
+        <w:ind w:hanging="0" w:left="720"/>
+        <w:jc w:val="left"/>
+        <w:rPr/>
+      </w:pPr>
+      <w:r>
+        <w:rPr/>
+      </w:r>
+    </w:p>
+    <w:p>
+      <w:pPr>
+        <w:pStyle w:val="Normal"/>
+        <w:numPr>
+          <w:ilvl w:val="0"/>
+          <w:numId w:val="2"/>
+        </w:numPr>
+        <w:bidi w:val="0"/>
+        <w:spacing w:lineRule="auto" w:line="360" w:before="57" w:after="57"/>
+        <w:jc w:val="left"/>
+        <w:rPr>
+          <w:u w:val="single"/>
+        </w:rPr>
+      </w:pPr>
+      <w:r>
+        <w:rPr>
+          <w:u w:val="single"/>
+        </w:rPr>
+        <w:t>Etiqueta de estilo</w:t>
+      </w:r>
+    </w:p>
+    <w:p>
+      <w:pPr>
+        <w:pStyle w:val="Normal"/>
+        <w:numPr>
+          <w:ilvl w:val="0"/>
+          <w:numId w:val="0"/>
+        </w:numPr>
+        <w:bidi w:val="0"/>
+        <w:spacing w:lineRule="auto" w:line="360" w:before="57" w:after="57"/>
+        <w:ind w:hanging="0" w:left="720"/>
+        <w:jc w:val="left"/>
+        <w:rPr>
+          <w:u w:val="none"/>
+        </w:rPr>
+      </w:pPr>
+      <w:r>
+        <w:rPr>
+          <w:u w:val="none"/>
+        </w:rPr>
+        <w:t xml:space="preserve">creación de archivo css </w:t>
+      </w:r>
+    </w:p>
+    <w:p>
+      <w:pPr>
+        <w:pStyle w:val="Normal"/>
+        <w:numPr>
+          <w:ilvl w:val="0"/>
+          <w:numId w:val="0"/>
+        </w:numPr>
+        <w:bidi w:val="0"/>
+        <w:spacing w:lineRule="auto" w:line="360" w:before="57" w:after="57"/>
+        <w:ind w:hanging="0" w:left="720"/>
+        <w:jc w:val="left"/>
+        <w:rPr>
+          <w:u w:val="none"/>
+        </w:rPr>
+      </w:pPr>
+      <w:r>
+        <w:rPr>
+          <w:u w:val="none"/>
+        </w:rPr>
+        <w:t>link rel="stylesheet" href="misEstilos.css"&gt;</w:t>
+      </w:r>
+    </w:p>
+    <w:p>
+      <w:pPr>
+        <w:pStyle w:val="Normal"/>
+        <w:numPr>
+          <w:ilvl w:val="0"/>
+          <w:numId w:val="0"/>
+        </w:numPr>
+        <w:bidi w:val="0"/>
+        <w:spacing w:lineRule="auto" w:line="360" w:before="57" w:after="57"/>
+        <w:ind w:hanging="0" w:left="720"/>
+        <w:jc w:val="left"/>
+        <w:rPr>
+          <w:u w:val="none"/>
+        </w:rPr>
+      </w:pPr>
+      <w:r>
+        <w:rPr>
+          <w:u w:val="none"/>
+        </w:rPr>
+      </w:r>
+    </w:p>
+    <w:p>
+      <w:pPr>
+        <w:pStyle w:val="Normal"/>
+        <w:numPr>
+          <w:ilvl w:val="0"/>
+          <w:numId w:val="2"/>
+        </w:numPr>
+        <w:bidi w:val="0"/>
+        <w:spacing w:lineRule="auto" w:line="360" w:before="57" w:after="57"/>
+        <w:jc w:val="left"/>
+        <w:rPr>
+          <w:u w:val="single"/>
+        </w:rPr>
+      </w:pPr>
+      <w:r>
+        <w:rPr>
+          <w:u w:val="single"/>
+        </w:rPr>
+        <w:t>Clases de Estilo</w:t>
+      </w:r>
+    </w:p>
+    <w:p>
+      <w:pPr>
+        <w:pStyle w:val="Normal"/>
+        <w:numPr>
+          <w:ilvl w:val="0"/>
+          <w:numId w:val="0"/>
+        </w:numPr>
+        <w:bidi w:val="0"/>
+        <w:spacing w:lineRule="auto" w:line="360" w:before="57" w:after="57"/>
+        <w:ind w:hanging="0" w:left="720"/>
+        <w:jc w:val="left"/>
+        <w:rPr>
+          <w:u w:val="none"/>
+        </w:rPr>
+      </w:pPr>
+      <w:r>
+        <w:rPr>
+          <w:u w:val="none"/>
+        </w:rPr>
+        <w:t>&lt;p class="normal"&gt;Párrafo común&lt;/p&gt;</w:t>
+      </w:r>
+    </w:p>
+    <w:p>
+      <w:pPr>
+        <w:pStyle w:val="Normal"/>
+        <w:numPr>
+          <w:ilvl w:val="0"/>
+          <w:numId w:val="0"/>
+        </w:numPr>
+        <w:bidi w:val="0"/>
+        <w:spacing w:lineRule="auto" w:line="360" w:before="57" w:after="57"/>
+        <w:ind w:hanging="0" w:left="720"/>
+        <w:jc w:val="left"/>
+        <w:rPr>
+          <w:u w:val="none"/>
+        </w:rPr>
+      </w:pPr>
+      <w:r>
+        <w:rPr>
+          <w:u w:val="none"/>
+        </w:rPr>
+        <w:t>&lt;p class="destacado"&gt;Párrafo especial&lt;/p&gt;</w:t>
+      </w:r>
+    </w:p>
+    <w:p>
+      <w:pPr>
+        <w:pStyle w:val="Normal"/>
+        <w:numPr>
+          <w:ilvl w:val="0"/>
+          <w:numId w:val="2"/>
+        </w:numPr>
+        <w:bidi w:val="0"/>
+        <w:spacing w:lineRule="auto" w:line="360" w:before="57" w:after="57"/>
+        <w:jc w:val="left"/>
+        <w:rPr>
+          <w:u w:val="none"/>
+        </w:rPr>
+      </w:pPr>
+      <w:r>
+        <w:rPr>
+          <w:u w:val="none"/>
         </w:rPr>
       </w:r>
     </w:p>
@@ -511,6 +795,7 @@
       <w:pgNumType w:fmt="decimal"/>
       <w:formProt w:val="false"/>
       <w:textDirection w:val="lrTb"/>
+      <w:docGrid w:type="default" w:linePitch="100" w:charSpace="0"/>
     </w:sectPr>
   </w:body>
 </w:document>
@@ -658,6 +943,143 @@
   <w:abstractNum w:abstractNumId="2">
     <w:lvl w:ilvl="0">
       <w:start w:val="1"/>
+      <w:numFmt w:val="bullet"/>
+      <w:lvlText w:val=""/>
+      <w:lvlJc w:val="left"/>
+      <w:pPr>
+        <w:tabs>
+          <w:tab w:val="num" w:pos="720"/>
+        </w:tabs>
+        <w:ind w:left="720" w:hanging="360"/>
+      </w:pPr>
+      <w:rPr>
+        <w:rFonts w:ascii="Symbol" w:hAnsi="Symbol" w:cs="Symbol" w:hint="default"/>
+      </w:rPr>
+    </w:lvl>
+    <w:lvl w:ilvl="1">
+      <w:start w:val="1"/>
+      <w:numFmt w:val="bullet"/>
+      <w:lvlText w:val="◦"/>
+      <w:lvlJc w:val="left"/>
+      <w:pPr>
+        <w:tabs>
+          <w:tab w:val="num" w:pos="1080"/>
+        </w:tabs>
+        <w:ind w:left="1080" w:hanging="360"/>
+      </w:pPr>
+      <w:rPr>
+        <w:rFonts w:ascii="OpenSymbol" w:hAnsi="OpenSymbol" w:cs="OpenSymbol" w:hint="default"/>
+      </w:rPr>
+    </w:lvl>
+    <w:lvl w:ilvl="2">
+      <w:start w:val="1"/>
+      <w:numFmt w:val="bullet"/>
+      <w:lvlText w:val="▪"/>
+      <w:lvlJc w:val="left"/>
+      <w:pPr>
+        <w:tabs>
+          <w:tab w:val="num" w:pos="1440"/>
+        </w:tabs>
+        <w:ind w:left="1440" w:hanging="360"/>
+      </w:pPr>
+      <w:rPr>
+        <w:rFonts w:ascii="OpenSymbol" w:hAnsi="OpenSymbol" w:cs="OpenSymbol" w:hint="default"/>
+      </w:rPr>
+    </w:lvl>
+    <w:lvl w:ilvl="3">
+      <w:start w:val="1"/>
+      <w:numFmt w:val="bullet"/>
+      <w:lvlText w:val=""/>
+      <w:lvlJc w:val="left"/>
+      <w:pPr>
+        <w:tabs>
+          <w:tab w:val="num" w:pos="1800"/>
+        </w:tabs>
+        <w:ind w:left="1800" w:hanging="360"/>
+      </w:pPr>
+      <w:rPr>
+        <w:rFonts w:ascii="Symbol" w:hAnsi="Symbol" w:cs="Symbol" w:hint="default"/>
+      </w:rPr>
+    </w:lvl>
+    <w:lvl w:ilvl="4">
+      <w:start w:val="1"/>
+      <w:numFmt w:val="bullet"/>
+      <w:lvlText w:val="◦"/>
+      <w:lvlJc w:val="left"/>
+      <w:pPr>
+        <w:tabs>
+          <w:tab w:val="num" w:pos="2160"/>
+        </w:tabs>
+        <w:ind w:left="2160" w:hanging="360"/>
+      </w:pPr>
+      <w:rPr>
+        <w:rFonts w:ascii="OpenSymbol" w:hAnsi="OpenSymbol" w:cs="OpenSymbol" w:hint="default"/>
+      </w:rPr>
+    </w:lvl>
+    <w:lvl w:ilvl="5">
+      <w:start w:val="1"/>
+      <w:numFmt w:val="bullet"/>
+      <w:lvlText w:val="▪"/>
+      <w:lvlJc w:val="left"/>
+      <w:pPr>
+        <w:tabs>
+          <w:tab w:val="num" w:pos="2520"/>
+        </w:tabs>
+        <w:ind w:left="2520" w:hanging="360"/>
+      </w:pPr>
+      <w:rPr>
+        <w:rFonts w:ascii="OpenSymbol" w:hAnsi="OpenSymbol" w:cs="OpenSymbol" w:hint="default"/>
+      </w:rPr>
+    </w:lvl>
+    <w:lvl w:ilvl="6">
+      <w:start w:val="1"/>
+      <w:numFmt w:val="bullet"/>
+      <w:lvlText w:val=""/>
+      <w:lvlJc w:val="left"/>
+      <w:pPr>
+        <w:tabs>
+          <w:tab w:val="num" w:pos="2880"/>
+        </w:tabs>
+        <w:ind w:left="2880" w:hanging="360"/>
+      </w:pPr>
+      <w:rPr>
+        <w:rFonts w:ascii="Symbol" w:hAnsi="Symbol" w:cs="Symbol" w:hint="default"/>
+      </w:rPr>
+    </w:lvl>
+    <w:lvl w:ilvl="7">
+      <w:start w:val="1"/>
+      <w:numFmt w:val="bullet"/>
+      <w:lvlText w:val="◦"/>
+      <w:lvlJc w:val="left"/>
+      <w:pPr>
+        <w:tabs>
+          <w:tab w:val="num" w:pos="3240"/>
+        </w:tabs>
+        <w:ind w:left="3240" w:hanging="360"/>
+      </w:pPr>
+      <w:rPr>
+        <w:rFonts w:ascii="OpenSymbol" w:hAnsi="OpenSymbol" w:cs="OpenSymbol" w:hint="default"/>
+      </w:rPr>
+    </w:lvl>
+    <w:lvl w:ilvl="8">
+      <w:start w:val="1"/>
+      <w:numFmt w:val="bullet"/>
+      <w:lvlText w:val="▪"/>
+      <w:lvlJc w:val="left"/>
+      <w:pPr>
+        <w:tabs>
+          <w:tab w:val="num" w:pos="3600"/>
+        </w:tabs>
+        <w:ind w:left="3600" w:hanging="360"/>
+      </w:pPr>
+      <w:rPr>
+        <w:rFonts w:ascii="OpenSymbol" w:hAnsi="OpenSymbol" w:cs="OpenSymbol" w:hint="default"/>
+      </w:rPr>
+    </w:lvl>
+  </w:abstractNum>
+  <w:abstractNum w:abstractNumId="3">
+    <w:lvl w:ilvl="0">
+      <w:start w:val="1"/>
       <w:numFmt w:val="none"/>
       <w:suff w:val="nothing"/>
       <w:lvlText w:val=""/>
@@ -779,6 +1201,9 @@
   </w:num>
   <w:num w:numId="2">
     <w:abstractNumId w:val="2"/>
+  </w:num>
+  <w:num w:numId="3">
+    <w:abstractNumId w:val="3"/>
   </w:num>
 </w:numbering>
 </file>
@@ -797,7 +1222,6 @@
     </w:rPrDefault>
     <w:pPrDefault>
       <w:pPr>
-        <w:widowControl/>
         <w:suppressAutoHyphens w:val="true"/>
       </w:pPr>
     </w:pPrDefault>
@@ -807,7 +1231,10 @@
     <w:qFormat/>
     <w:pPr>
       <w:widowControl/>
+      <w:suppressAutoHyphens w:val="true"/>
       <w:bidi w:val="0"/>
+      <w:spacing w:before="0" w:after="0"/>
+      <w:jc w:val="left"/>
     </w:pPr>
     <w:rPr>
       <w:rFonts w:ascii="Liberation Serif" w:hAnsi="Liberation Serif" w:eastAsia="Noto Serif CJK SC" w:cs="FreeSans"/>

</xml_diff>

<commit_message>
dia 03 a dia 07
</commit_message>
<xml_diff>
--- a/resumen.docx
+++ b/resumen.docx
@@ -1106,6 +1106,83 @@
         <w:rPr>
           <w:u w:val="single"/>
         </w:rPr>
+        <w:drawing>
+          <wp:anchor behindDoc="0" distT="0" distB="0" distL="0" distR="0" simplePos="0" locked="0" layoutInCell="0" allowOverlap="1" relativeHeight="5">
+            <wp:simplePos x="0" y="0"/>
+            <wp:positionH relativeFrom="column">
+              <wp:posOffset>136525</wp:posOffset>
+            </wp:positionH>
+            <wp:positionV relativeFrom="paragraph">
+              <wp:posOffset>79375</wp:posOffset>
+            </wp:positionV>
+            <wp:extent cx="2242185" cy="1314450"/>
+            <wp:effectExtent l="0" t="0" r="0" b="0"/>
+            <wp:wrapSquare wrapText="largest"/>
+            <wp:docPr id="4" name="Imagen4" descr=""/>
+            <wp:cNvGraphicFramePr>
+              <a:graphicFrameLocks xmlns:a="http://schemas.openxmlformats.org/drawingml/2006/main" noChangeAspect="1"/>
+            </wp:cNvGraphicFramePr>
+            <a:graphic xmlns:a="http://schemas.openxmlformats.org/drawingml/2006/main">
+              <a:graphicData uri="http://schemas.openxmlformats.org/drawingml/2006/picture">
+                <pic:pic xmlns:pic="http://schemas.openxmlformats.org/drawingml/2006/picture">
+                  <pic:nvPicPr>
+                    <pic:cNvPr id="4" name="Imagen4" descr=""/>
+                    <pic:cNvPicPr>
+                      <a:picLocks noChangeAspect="1" noChangeArrowheads="1"/>
+                    </pic:cNvPicPr>
+                  </pic:nvPicPr>
+                  <pic:blipFill>
+                    <a:blip r:embed="rId5"/>
+                    <a:stretch>
+                      <a:fillRect/>
+                    </a:stretch>
+                  </pic:blipFill>
+                  <pic:spPr bwMode="auto">
+                    <a:xfrm>
+                      <a:off x="0" y="0"/>
+                      <a:ext cx="2242185" cy="1314450"/>
+                    </a:xfrm>
+                    <a:prstGeom prst="rect">
+                      <a:avLst/>
+                    </a:prstGeom>
+                  </pic:spPr>
+                </pic:pic>
+              </a:graphicData>
+            </a:graphic>
+          </wp:anchor>
+        </w:drawing>
+      </w:r>
+    </w:p>
+    <w:p>
+      <w:pPr>
+        <w:pStyle w:val="Normal"/>
+        <w:bidi w:val="0"/>
+        <w:spacing w:lineRule="auto" w:line="360" w:before="57" w:after="57"/>
+        <w:jc w:val="left"/>
+        <w:rPr>
+          <w:u w:val="single"/>
+        </w:rPr>
+      </w:pPr>
+      <w:r>
+        <w:rPr>
+          <w:u w:val="single"/>
+        </w:rPr>
+      </w:r>
+    </w:p>
+    <w:p>
+      <w:pPr>
+        <w:pStyle w:val="Normal"/>
+        <w:bidi w:val="0"/>
+        <w:spacing w:lineRule="auto" w:line="360" w:before="57" w:after="57"/>
+        <w:jc w:val="left"/>
+        <w:rPr>
+          <w:u w:val="single"/>
+        </w:rPr>
+      </w:pPr>
+      <w:r>
+        <w:rPr>
+          <w:u w:val="single"/>
+        </w:rPr>
       </w:r>
     </w:p>
     <w:p>
@@ -1190,45 +1267,363 @@
         <w:rPr>
           <w:u w:val="single"/>
         </w:rPr>
-      </w:r>
-    </w:p>
-    <w:p>
-      <w:pPr>
-        <w:pStyle w:val="Normal"/>
-        <w:bidi w:val="0"/>
-        <w:spacing w:lineRule="auto" w:line="360" w:before="57" w:after="57"/>
-        <w:jc w:val="left"/>
-        <w:rPr>
-          <w:u w:val="single"/>
-        </w:rPr>
-      </w:pPr>
-      <w:r>
-        <w:rPr>
-          <w:u w:val="single"/>
-        </w:rPr>
-      </w:r>
-    </w:p>
-    <w:p>
-      <w:pPr>
-        <w:pStyle w:val="Normal"/>
-        <w:bidi w:val="0"/>
-        <w:spacing w:lineRule="auto" w:line="360" w:before="57" w:after="57"/>
-        <w:jc w:val="left"/>
-        <w:rPr>
-          <w:u w:val="single"/>
-        </w:rPr>
-      </w:pPr>
-      <w:r>
-        <w:rPr>
-          <w:u w:val="single"/>
-        </w:rPr>
-      </w:r>
-    </w:p>
-    <w:p>
-      <w:pPr>
-        <w:pStyle w:val="Normal"/>
-        <w:bidi w:val="0"/>
-        <w:spacing w:lineRule="auto" w:line="360" w:before="57" w:after="57"/>
+        <w:t>Combinadores</w:t>
+      </w:r>
+    </w:p>
+    <w:p>
+      <w:pPr>
+        <w:pStyle w:val="Normal"/>
+        <w:bidi w:val="0"/>
+        <w:spacing w:lineRule="auto" w:line="360" w:before="57" w:after="57"/>
+        <w:jc w:val="left"/>
+        <w:rPr>
+          <w:u w:val="single"/>
+        </w:rPr>
+      </w:pPr>
+      <w:r>
+        <w:rPr>
+          <w:u w:val="single"/>
+        </w:rPr>
+        <w:drawing>
+          <wp:anchor behindDoc="0" distT="0" distB="0" distL="0" distR="0" simplePos="0" locked="0" layoutInCell="0" allowOverlap="1" relativeHeight="6">
+            <wp:simplePos x="0" y="0"/>
+            <wp:positionH relativeFrom="column">
+              <wp:posOffset>457200</wp:posOffset>
+            </wp:positionH>
+            <wp:positionV relativeFrom="paragraph">
+              <wp:posOffset>-19050</wp:posOffset>
+            </wp:positionV>
+            <wp:extent cx="2074545" cy="996315"/>
+            <wp:effectExtent l="0" t="0" r="0" b="0"/>
+            <wp:wrapSquare wrapText="largest"/>
+            <wp:docPr id="5" name="Imagen5" descr=""/>
+            <wp:cNvGraphicFramePr>
+              <a:graphicFrameLocks xmlns:a="http://schemas.openxmlformats.org/drawingml/2006/main" noChangeAspect="1"/>
+            </wp:cNvGraphicFramePr>
+            <a:graphic xmlns:a="http://schemas.openxmlformats.org/drawingml/2006/main">
+              <a:graphicData uri="http://schemas.openxmlformats.org/drawingml/2006/picture">
+                <pic:pic xmlns:pic="http://schemas.openxmlformats.org/drawingml/2006/picture">
+                  <pic:nvPicPr>
+                    <pic:cNvPr id="5" name="Imagen5" descr=""/>
+                    <pic:cNvPicPr>
+                      <a:picLocks noChangeAspect="1" noChangeArrowheads="1"/>
+                    </pic:cNvPicPr>
+                  </pic:nvPicPr>
+                  <pic:blipFill>
+                    <a:blip r:embed="rId6"/>
+                    <a:stretch>
+                      <a:fillRect/>
+                    </a:stretch>
+                  </pic:blipFill>
+                  <pic:spPr bwMode="auto">
+                    <a:xfrm>
+                      <a:off x="0" y="0"/>
+                      <a:ext cx="2074545" cy="996315"/>
+                    </a:xfrm>
+                    <a:prstGeom prst="rect">
+                      <a:avLst/>
+                    </a:prstGeom>
+                  </pic:spPr>
+                </pic:pic>
+              </a:graphicData>
+            </a:graphic>
+          </wp:anchor>
+        </w:drawing>
+        <w:drawing>
+          <wp:anchor behindDoc="0" distT="0" distB="0" distL="0" distR="0" simplePos="0" locked="0" layoutInCell="0" allowOverlap="1" relativeHeight="7">
+            <wp:simplePos x="0" y="0"/>
+            <wp:positionH relativeFrom="column">
+              <wp:posOffset>2717800</wp:posOffset>
+            </wp:positionH>
+            <wp:positionV relativeFrom="paragraph">
+              <wp:posOffset>-59055</wp:posOffset>
+            </wp:positionV>
+            <wp:extent cx="1916430" cy="1116965"/>
+            <wp:effectExtent l="0" t="0" r="0" b="0"/>
+            <wp:wrapSquare wrapText="largest"/>
+            <wp:docPr id="6" name="Imagen6" descr=""/>
+            <wp:cNvGraphicFramePr>
+              <a:graphicFrameLocks xmlns:a="http://schemas.openxmlformats.org/drawingml/2006/main" noChangeAspect="1"/>
+            </wp:cNvGraphicFramePr>
+            <a:graphic xmlns:a="http://schemas.openxmlformats.org/drawingml/2006/main">
+              <a:graphicData uri="http://schemas.openxmlformats.org/drawingml/2006/picture">
+                <pic:pic xmlns:pic="http://schemas.openxmlformats.org/drawingml/2006/picture">
+                  <pic:nvPicPr>
+                    <pic:cNvPr id="6" name="Imagen6" descr=""/>
+                    <pic:cNvPicPr>
+                      <a:picLocks noChangeAspect="1" noChangeArrowheads="1"/>
+                    </pic:cNvPicPr>
+                  </pic:nvPicPr>
+                  <pic:blipFill>
+                    <a:blip r:embed="rId7"/>
+                    <a:stretch>
+                      <a:fillRect/>
+                    </a:stretch>
+                  </pic:blipFill>
+                  <pic:spPr bwMode="auto">
+                    <a:xfrm>
+                      <a:off x="0" y="0"/>
+                      <a:ext cx="1916430" cy="1116965"/>
+                    </a:xfrm>
+                    <a:prstGeom prst="rect">
+                      <a:avLst/>
+                    </a:prstGeom>
+                  </pic:spPr>
+                </pic:pic>
+              </a:graphicData>
+            </a:graphic>
+          </wp:anchor>
+        </w:drawing>
+        <w:drawing>
+          <wp:anchor behindDoc="0" distT="0" distB="0" distL="0" distR="0" simplePos="0" locked="0" layoutInCell="0" allowOverlap="1" relativeHeight="8">
+            <wp:simplePos x="0" y="0"/>
+            <wp:positionH relativeFrom="column">
+              <wp:posOffset>4827905</wp:posOffset>
+            </wp:positionH>
+            <wp:positionV relativeFrom="paragraph">
+              <wp:posOffset>20955</wp:posOffset>
+            </wp:positionV>
+            <wp:extent cx="1527810" cy="960120"/>
+            <wp:effectExtent l="0" t="0" r="0" b="0"/>
+            <wp:wrapSquare wrapText="largest"/>
+            <wp:docPr id="7" name="Imagen7" descr=""/>
+            <wp:cNvGraphicFramePr>
+              <a:graphicFrameLocks xmlns:a="http://schemas.openxmlformats.org/drawingml/2006/main" noChangeAspect="1"/>
+            </wp:cNvGraphicFramePr>
+            <a:graphic xmlns:a="http://schemas.openxmlformats.org/drawingml/2006/main">
+              <a:graphicData uri="http://schemas.openxmlformats.org/drawingml/2006/picture">
+                <pic:pic xmlns:pic="http://schemas.openxmlformats.org/drawingml/2006/picture">
+                  <pic:nvPicPr>
+                    <pic:cNvPr id="7" name="Imagen7" descr=""/>
+                    <pic:cNvPicPr>
+                      <a:picLocks noChangeAspect="1" noChangeArrowheads="1"/>
+                    </pic:cNvPicPr>
+                  </pic:nvPicPr>
+                  <pic:blipFill>
+                    <a:blip r:embed="rId8"/>
+                    <a:stretch>
+                      <a:fillRect/>
+                    </a:stretch>
+                  </pic:blipFill>
+                  <pic:spPr bwMode="auto">
+                    <a:xfrm>
+                      <a:off x="0" y="0"/>
+                      <a:ext cx="1527810" cy="960120"/>
+                    </a:xfrm>
+                    <a:prstGeom prst="rect">
+                      <a:avLst/>
+                    </a:prstGeom>
+                  </pic:spPr>
+                </pic:pic>
+              </a:graphicData>
+            </a:graphic>
+          </wp:anchor>
+        </w:drawing>
+      </w:r>
+    </w:p>
+    <w:p>
+      <w:pPr>
+        <w:pStyle w:val="Normal"/>
+        <w:bidi w:val="0"/>
+        <w:spacing w:lineRule="auto" w:line="360" w:before="57" w:after="57"/>
+        <w:jc w:val="left"/>
+        <w:rPr>
+          <w:u w:val="single"/>
+        </w:rPr>
+      </w:pPr>
+      <w:r>
+        <w:rPr>
+          <w:u w:val="single"/>
+        </w:rPr>
+      </w:r>
+    </w:p>
+    <w:p>
+      <w:pPr>
+        <w:pStyle w:val="Normal"/>
+        <w:bidi w:val="0"/>
+        <w:spacing w:lineRule="auto" w:line="360" w:before="57" w:after="57"/>
+        <w:jc w:val="left"/>
+        <w:rPr>
+          <w:u w:val="single"/>
+        </w:rPr>
+      </w:pPr>
+      <w:r>
+        <w:rPr>
+          <w:u w:val="single"/>
+        </w:rPr>
+      </w:r>
+    </w:p>
+    <w:p>
+      <w:pPr>
+        <w:pStyle w:val="Normal"/>
+        <w:bidi w:val="0"/>
+        <w:spacing w:lineRule="auto" w:line="360" w:before="57" w:after="57"/>
+        <w:jc w:val="left"/>
+        <w:rPr>
+          <w:u w:val="single"/>
+        </w:rPr>
+      </w:pPr>
+      <w:r>
+        <w:rPr>
+          <w:u w:val="single"/>
+        </w:rPr>
+      </w:r>
+    </w:p>
+    <w:p>
+      <w:pPr>
+        <w:pStyle w:val="Normal"/>
+        <w:bidi w:val="0"/>
+        <w:spacing w:lineRule="auto" w:line="360" w:before="57" w:after="57"/>
+        <w:jc w:val="left"/>
+        <w:rPr>
+          <w:u w:val="single"/>
+        </w:rPr>
+      </w:pPr>
+      <w:r>
+        <w:rPr>
+          <w:u w:val="single"/>
+        </w:rPr>
+        <w:drawing>
+          <wp:anchor behindDoc="0" distT="0" distB="0" distL="0" distR="0" simplePos="0" locked="0" layoutInCell="0" allowOverlap="1" relativeHeight="9">
+            <wp:simplePos x="0" y="0"/>
+            <wp:positionH relativeFrom="column">
+              <wp:align>center</wp:align>
+            </wp:positionH>
+            <wp:positionV relativeFrom="paragraph">
+              <wp:posOffset>635</wp:posOffset>
+            </wp:positionV>
+            <wp:extent cx="1847215" cy="1456690"/>
+            <wp:effectExtent l="0" t="0" r="0" b="0"/>
+            <wp:wrapSquare wrapText="largest"/>
+            <wp:docPr id="8" name="Imagen8" descr=""/>
+            <wp:cNvGraphicFramePr>
+              <a:graphicFrameLocks xmlns:a="http://schemas.openxmlformats.org/drawingml/2006/main" noChangeAspect="1"/>
+            </wp:cNvGraphicFramePr>
+            <a:graphic xmlns:a="http://schemas.openxmlformats.org/drawingml/2006/main">
+              <a:graphicData uri="http://schemas.openxmlformats.org/drawingml/2006/picture">
+                <pic:pic xmlns:pic="http://schemas.openxmlformats.org/drawingml/2006/picture">
+                  <pic:nvPicPr>
+                    <pic:cNvPr id="8" name="Imagen8" descr=""/>
+                    <pic:cNvPicPr>
+                      <a:picLocks noChangeAspect="1" noChangeArrowheads="1"/>
+                    </pic:cNvPicPr>
+                  </pic:nvPicPr>
+                  <pic:blipFill>
+                    <a:blip r:embed="rId9"/>
+                    <a:stretch>
+                      <a:fillRect/>
+                    </a:stretch>
+                  </pic:blipFill>
+                  <pic:spPr bwMode="auto">
+                    <a:xfrm>
+                      <a:off x="0" y="0"/>
+                      <a:ext cx="1847215" cy="1456690"/>
+                    </a:xfrm>
+                    <a:prstGeom prst="rect">
+                      <a:avLst/>
+                    </a:prstGeom>
+                  </pic:spPr>
+                </pic:pic>
+              </a:graphicData>
+            </a:graphic>
+          </wp:anchor>
+        </w:drawing>
+      </w:r>
+    </w:p>
+    <w:p>
+      <w:pPr>
+        <w:pStyle w:val="Normal"/>
+        <w:bidi w:val="0"/>
+        <w:spacing w:lineRule="auto" w:line="360" w:before="57" w:after="57"/>
+        <w:jc w:val="left"/>
+        <w:rPr>
+          <w:u w:val="single"/>
+        </w:rPr>
+      </w:pPr>
+      <w:r>
+        <w:rPr>
+          <w:u w:val="single"/>
+        </w:rPr>
+      </w:r>
+    </w:p>
+    <w:p>
+      <w:pPr>
+        <w:pStyle w:val="Normal"/>
+        <w:bidi w:val="0"/>
+        <w:spacing w:lineRule="auto" w:line="360" w:before="57" w:after="57"/>
+        <w:jc w:val="left"/>
+        <w:rPr>
+          <w:u w:val="single"/>
+        </w:rPr>
+      </w:pPr>
+      <w:r>
+        <w:rPr>
+          <w:u w:val="single"/>
+        </w:rPr>
+      </w:r>
+    </w:p>
+    <w:p>
+      <w:pPr>
+        <w:pStyle w:val="Normal"/>
+        <w:bidi w:val="0"/>
+        <w:spacing w:lineRule="auto" w:line="360" w:before="57" w:after="57"/>
+        <w:jc w:val="left"/>
+        <w:rPr>
+          <w:u w:val="single"/>
+        </w:rPr>
+      </w:pPr>
+      <w:r>
+        <w:rPr>
+          <w:u w:val="single"/>
+        </w:rPr>
+      </w:r>
+    </w:p>
+    <w:p>
+      <w:pPr>
+        <w:pStyle w:val="Normal"/>
+        <w:bidi w:val="0"/>
+        <w:spacing w:lineRule="auto" w:line="360" w:before="57" w:after="57"/>
+        <w:jc w:val="left"/>
+        <w:rPr>
+          <w:u w:val="single"/>
+        </w:rPr>
+      </w:pPr>
+      <w:r>
+        <w:rPr>
+          <w:u w:val="single"/>
+        </w:rPr>
+      </w:r>
+    </w:p>
+    <w:p>
+      <w:pPr>
+        <w:pStyle w:val="Normal"/>
+        <w:numPr>
+          <w:ilvl w:val="0"/>
+          <w:numId w:val="2"/>
+        </w:numPr>
+        <w:bidi w:val="0"/>
+        <w:spacing w:lineRule="auto" w:line="360" w:before="57" w:after="57"/>
+        <w:jc w:val="left"/>
+        <w:rPr>
+          <w:u w:val="single"/>
+        </w:rPr>
+      </w:pPr>
+      <w:r>
+        <w:rPr>
+          <w:u w:val="single"/>
+        </w:rPr>
+      </w:r>
+    </w:p>
+    <w:p>
+      <w:pPr>
+        <w:pStyle w:val="Normal"/>
+        <w:numPr>
+          <w:ilvl w:val="0"/>
+          <w:numId w:val="0"/>
+        </w:numPr>
+        <w:bidi w:val="0"/>
+        <w:spacing w:lineRule="auto" w:line="360" w:before="57" w:after="57"/>
+        <w:ind w:hanging="0" w:left="720"/>
         <w:jc w:val="left"/>
         <w:rPr>
           <w:u w:val="single"/>

</xml_diff>

<commit_message>
hasta dia03 4 - Tipos de Datos
</commit_message>
<xml_diff>
--- a/resumen.docx
+++ b/resumen.docx
@@ -770,7 +770,9 @@
         </w:rPr>
       </w:pPr>
       <w:r>
-        <w:rPr/>
+        <w:rPr>
+          <w:u w:val="none"/>
+        </w:rPr>
       </w:r>
     </w:p>
     <w:p>
@@ -1599,26 +1601,6 @@
         <w:pStyle w:val="Normal"/>
         <w:numPr>
           <w:ilvl w:val="0"/>
-          <w:numId w:val="2"/>
-        </w:numPr>
-        <w:bidi w:val="0"/>
-        <w:spacing w:lineRule="auto" w:line="360" w:before="57" w:after="57"/>
-        <w:jc w:val="left"/>
-        <w:rPr>
-          <w:u w:val="single"/>
-        </w:rPr>
-      </w:pPr>
-      <w:r>
-        <w:rPr>
-          <w:u w:val="single"/>
-        </w:rPr>
-      </w:r>
-    </w:p>
-    <w:p>
-      <w:pPr>
-        <w:pStyle w:val="Normal"/>
-        <w:numPr>
-          <w:ilvl w:val="0"/>
           <w:numId w:val="0"/>
         </w:numPr>
         <w:bidi w:val="0"/>
@@ -1642,44 +1624,258 @@
         <w:spacing w:lineRule="auto" w:line="360" w:before="57" w:after="57"/>
         <w:jc w:val="left"/>
         <w:rPr>
-          <w:u w:val="single"/>
-        </w:rPr>
-      </w:pPr>
-      <w:r>
-        <w:rPr>
-          <w:u w:val="single"/>
-        </w:rPr>
-      </w:r>
-    </w:p>
-    <w:p>
-      <w:pPr>
-        <w:pStyle w:val="Normal"/>
-        <w:bidi w:val="0"/>
-        <w:spacing w:lineRule="auto" w:line="360" w:before="57" w:after="57"/>
-        <w:jc w:val="left"/>
-        <w:rPr>
-          <w:u w:val="none"/>
-        </w:rPr>
-      </w:pPr>
-      <w:r>
-        <w:rPr>
-          <w:u w:val="single"/>
-        </w:rPr>
-      </w:r>
-    </w:p>
-    <w:p>
-      <w:pPr>
-        <w:pStyle w:val="Normal"/>
-        <w:bidi w:val="0"/>
-        <w:spacing w:lineRule="auto" w:line="360" w:before="57" w:after="57"/>
-        <w:jc w:val="left"/>
-        <w:rPr>
-          <w:u w:val="none"/>
-        </w:rPr>
-      </w:pPr>
-      <w:r>
-        <w:rPr>
-          <w:u w:val="single"/>
+          <w:b/>
+          <w:bCs/>
+        </w:rPr>
+      </w:pPr>
+      <w:r>
+        <w:rPr>
+          <w:b/>
+          <w:bCs/>
+        </w:rPr>
+        <w:t>Dia 0</w:t>
+      </w:r>
+      <w:r>
+        <w:rPr>
+          <w:b/>
+          <w:bCs/>
+        </w:rPr>
+        <w:t>3</w:t>
+      </w:r>
+      <w:r>
+        <w:rPr>
+          <w:b/>
+          <w:bCs/>
+        </w:rPr>
+        <w:t xml:space="preserve"> </w:t>
+      </w:r>
+      <w:r>
+        <w:rPr>
+          <w:b/>
+          <w:bCs/>
+        </w:rPr>
+        <w:t>JAVASCRIPT</w:t>
+      </w:r>
+    </w:p>
+    <w:p>
+      <w:pPr>
+        <w:pStyle w:val="Normal"/>
+        <w:numPr>
+          <w:ilvl w:val="0"/>
+          <w:numId w:val="3"/>
+        </w:numPr>
+        <w:bidi w:val="0"/>
+        <w:spacing w:lineRule="auto" w:line="360" w:before="57" w:after="57"/>
+        <w:jc w:val="left"/>
+        <w:rPr>
+          <w:u w:val="single"/>
+        </w:rPr>
+      </w:pPr>
+      <w:r>
+        <w:rPr>
+          <w:u w:val="single"/>
+        </w:rPr>
+        <w:t>Saludo(Hola mundo)</w:t>
+      </w:r>
+    </w:p>
+    <w:p>
+      <w:pPr>
+        <w:pStyle w:val="Normal"/>
+        <w:numPr>
+          <w:ilvl w:val="0"/>
+          <w:numId w:val="3"/>
+        </w:numPr>
+        <w:bidi w:val="0"/>
+        <w:spacing w:lineRule="auto" w:line="360" w:before="57" w:after="57"/>
+        <w:jc w:val="left"/>
+        <w:rPr>
+          <w:u w:val="single"/>
+        </w:rPr>
+      </w:pPr>
+      <w:r>
+        <w:rPr>
+          <w:u w:val="single"/>
+        </w:rPr>
+        <w:t>Ingreso de usuario</w:t>
+      </w:r>
+    </w:p>
+    <w:p>
+      <w:pPr>
+        <w:pStyle w:val="Normal"/>
+        <w:numPr>
+          <w:ilvl w:val="0"/>
+          <w:numId w:val="3"/>
+        </w:numPr>
+        <w:bidi w:val="0"/>
+        <w:spacing w:lineRule="auto" w:line="360" w:before="57" w:after="57"/>
+        <w:jc w:val="left"/>
+        <w:rPr>
+          <w:u w:val="single"/>
+        </w:rPr>
+      </w:pPr>
+      <w:r>
+        <w:rPr>
+          <w:u w:val="single"/>
+        </w:rPr>
+        <w:t>Variables</w:t>
+      </w:r>
+    </w:p>
+    <w:p>
+      <w:pPr>
+        <w:pStyle w:val="Normal"/>
+        <w:numPr>
+          <w:ilvl w:val="0"/>
+          <w:numId w:val="0"/>
+        </w:numPr>
+        <w:bidi w:val="0"/>
+        <w:spacing w:lineRule="auto" w:line="360" w:before="57" w:after="57"/>
+        <w:ind w:hanging="0" w:left="720"/>
+        <w:jc w:val="left"/>
+        <w:rPr/>
+      </w:pPr>
+      <w:r>
+        <w:rPr>
+          <w:u w:val="none"/>
+        </w:rPr>
+        <w:t xml:space="preserve">let nombreVariable  </w:t>
+      </w:r>
+      <w:r>
+        <w:rPr/>
+        <w:t>Camel Case (El estándar de JS)</w:t>
+      </w:r>
+    </w:p>
+    <w:p>
+      <w:pPr>
+        <w:pStyle w:val="Normal"/>
+        <w:numPr>
+          <w:ilvl w:val="0"/>
+          <w:numId w:val="0"/>
+        </w:numPr>
+        <w:bidi w:val="0"/>
+        <w:spacing w:lineRule="auto" w:line="360" w:before="57" w:after="57"/>
+        <w:ind w:hanging="0" w:left="720"/>
+        <w:jc w:val="left"/>
+        <w:rPr/>
+      </w:pPr>
+      <w:r>
+        <w:rPr>
+          <w:u w:val="none"/>
+        </w:rPr>
+        <w:t xml:space="preserve">const numeroPi  </w:t>
+      </w:r>
+      <w:r>
+        <w:rPr/>
+        <w:t>UPPER_SCASE (Constantes globales)</w:t>
+      </w:r>
+    </w:p>
+    <w:p>
+      <w:pPr>
+        <w:pStyle w:val="Normal"/>
+        <w:numPr>
+          <w:ilvl w:val="0"/>
+          <w:numId w:val="3"/>
+        </w:numPr>
+        <w:bidi w:val="0"/>
+        <w:spacing w:lineRule="auto" w:line="360" w:before="57" w:after="57"/>
+        <w:jc w:val="left"/>
+        <w:rPr>
+          <w:u w:val="single"/>
+        </w:rPr>
+      </w:pPr>
+      <w:r>
+        <w:rPr>
+          <w:u w:val="single"/>
+        </w:rPr>
+        <w:t>Tipos de Datos</w:t>
+      </w:r>
+    </w:p>
+    <w:p>
+      <w:pPr>
+        <w:pStyle w:val="Normal"/>
+        <w:numPr>
+          <w:ilvl w:val="0"/>
+          <w:numId w:val="0"/>
+        </w:numPr>
+        <w:bidi w:val="0"/>
+        <w:spacing w:lineRule="auto" w:line="360" w:before="57" w:after="57"/>
+        <w:ind w:hanging="0" w:left="720"/>
+        <w:jc w:val="left"/>
+        <w:rPr>
+          <w:u w:val="none"/>
+        </w:rPr>
+      </w:pPr>
+      <w:r>
+        <w:rPr>
+          <w:u w:val="none"/>
+        </w:rPr>
+        <w:t>numeros, strings, boobleanos, arrays, objetos</w:t>
+      </w:r>
+    </w:p>
+    <w:p>
+      <w:pPr>
+        <w:pStyle w:val="Normal"/>
+        <w:numPr>
+          <w:ilvl w:val="0"/>
+          <w:numId w:val="3"/>
+        </w:numPr>
+        <w:bidi w:val="0"/>
+        <w:spacing w:lineRule="auto" w:line="360" w:before="57" w:after="57"/>
+        <w:jc w:val="left"/>
+        <w:rPr>
+          <w:u w:val="single"/>
+        </w:rPr>
+      </w:pPr>
+      <w:r>
+        <w:rPr>
+          <w:u w:val="single"/>
+        </w:rPr>
+      </w:r>
+    </w:p>
+    <w:p>
+      <w:pPr>
+        <w:pStyle w:val="Normal"/>
+        <w:bidi w:val="0"/>
+        <w:spacing w:lineRule="auto" w:line="360" w:before="57" w:after="57"/>
+        <w:jc w:val="left"/>
+        <w:rPr>
+          <w:u w:val="single"/>
+        </w:rPr>
+      </w:pPr>
+      <w:r>
+        <w:rPr>
+          <w:u w:val="single"/>
+        </w:rPr>
+      </w:r>
+    </w:p>
+    <w:p>
+      <w:pPr>
+        <w:pStyle w:val="Normal"/>
+        <w:bidi w:val="0"/>
+        <w:spacing w:lineRule="auto" w:line="360" w:before="57" w:after="57"/>
+        <w:jc w:val="left"/>
+        <w:rPr>
+          <w:u w:val="none"/>
+        </w:rPr>
+      </w:pPr>
+      <w:r>
+        <w:rPr>
+          <w:u w:val="none"/>
+        </w:rPr>
+      </w:r>
+    </w:p>
+    <w:p>
+      <w:pPr>
+        <w:pStyle w:val="Normal"/>
+        <w:bidi w:val="0"/>
+        <w:spacing w:lineRule="auto" w:line="360" w:before="57" w:after="57"/>
+        <w:jc w:val="left"/>
+        <w:rPr>
+          <w:u w:val="none"/>
+        </w:rPr>
+      </w:pPr>
+      <w:r>
+        <w:rPr>
+          <w:u w:val="none"/>
         </w:rPr>
       </w:r>
     </w:p>
@@ -1975,6 +2171,143 @@
   <w:abstractNum w:abstractNumId="3">
     <w:lvl w:ilvl="0">
       <w:start w:val="1"/>
+      <w:numFmt w:val="bullet"/>
+      <w:lvlText w:val=""/>
+      <w:lvlJc w:val="left"/>
+      <w:pPr>
+        <w:tabs>
+          <w:tab w:val="num" w:pos="720"/>
+        </w:tabs>
+        <w:ind w:left="720" w:hanging="360"/>
+      </w:pPr>
+      <w:rPr>
+        <w:rFonts w:ascii="Symbol" w:hAnsi="Symbol" w:cs="Symbol" w:hint="default"/>
+      </w:rPr>
+    </w:lvl>
+    <w:lvl w:ilvl="1">
+      <w:start w:val="1"/>
+      <w:numFmt w:val="bullet"/>
+      <w:lvlText w:val="◦"/>
+      <w:lvlJc w:val="left"/>
+      <w:pPr>
+        <w:tabs>
+          <w:tab w:val="num" w:pos="1080"/>
+        </w:tabs>
+        <w:ind w:left="1080" w:hanging="360"/>
+      </w:pPr>
+      <w:rPr>
+        <w:rFonts w:ascii="OpenSymbol" w:hAnsi="OpenSymbol" w:cs="OpenSymbol" w:hint="default"/>
+      </w:rPr>
+    </w:lvl>
+    <w:lvl w:ilvl="2">
+      <w:start w:val="1"/>
+      <w:numFmt w:val="bullet"/>
+      <w:lvlText w:val="▪"/>
+      <w:lvlJc w:val="left"/>
+      <w:pPr>
+        <w:tabs>
+          <w:tab w:val="num" w:pos="1440"/>
+        </w:tabs>
+        <w:ind w:left="1440" w:hanging="360"/>
+      </w:pPr>
+      <w:rPr>
+        <w:rFonts w:ascii="OpenSymbol" w:hAnsi="OpenSymbol" w:cs="OpenSymbol" w:hint="default"/>
+      </w:rPr>
+    </w:lvl>
+    <w:lvl w:ilvl="3">
+      <w:start w:val="1"/>
+      <w:numFmt w:val="bullet"/>
+      <w:lvlText w:val=""/>
+      <w:lvlJc w:val="left"/>
+      <w:pPr>
+        <w:tabs>
+          <w:tab w:val="num" w:pos="1800"/>
+        </w:tabs>
+        <w:ind w:left="1800" w:hanging="360"/>
+      </w:pPr>
+      <w:rPr>
+        <w:rFonts w:ascii="Symbol" w:hAnsi="Symbol" w:cs="Symbol" w:hint="default"/>
+      </w:rPr>
+    </w:lvl>
+    <w:lvl w:ilvl="4">
+      <w:start w:val="1"/>
+      <w:numFmt w:val="bullet"/>
+      <w:lvlText w:val="◦"/>
+      <w:lvlJc w:val="left"/>
+      <w:pPr>
+        <w:tabs>
+          <w:tab w:val="num" w:pos="2160"/>
+        </w:tabs>
+        <w:ind w:left="2160" w:hanging="360"/>
+      </w:pPr>
+      <w:rPr>
+        <w:rFonts w:ascii="OpenSymbol" w:hAnsi="OpenSymbol" w:cs="OpenSymbol" w:hint="default"/>
+      </w:rPr>
+    </w:lvl>
+    <w:lvl w:ilvl="5">
+      <w:start w:val="1"/>
+      <w:numFmt w:val="bullet"/>
+      <w:lvlText w:val="▪"/>
+      <w:lvlJc w:val="left"/>
+      <w:pPr>
+        <w:tabs>
+          <w:tab w:val="num" w:pos="2520"/>
+        </w:tabs>
+        <w:ind w:left="2520" w:hanging="360"/>
+      </w:pPr>
+      <w:rPr>
+        <w:rFonts w:ascii="OpenSymbol" w:hAnsi="OpenSymbol" w:cs="OpenSymbol" w:hint="default"/>
+      </w:rPr>
+    </w:lvl>
+    <w:lvl w:ilvl="6">
+      <w:start w:val="1"/>
+      <w:numFmt w:val="bullet"/>
+      <w:lvlText w:val=""/>
+      <w:lvlJc w:val="left"/>
+      <w:pPr>
+        <w:tabs>
+          <w:tab w:val="num" w:pos="2880"/>
+        </w:tabs>
+        <w:ind w:left="2880" w:hanging="360"/>
+      </w:pPr>
+      <w:rPr>
+        <w:rFonts w:ascii="Symbol" w:hAnsi="Symbol" w:cs="Symbol" w:hint="default"/>
+      </w:rPr>
+    </w:lvl>
+    <w:lvl w:ilvl="7">
+      <w:start w:val="1"/>
+      <w:numFmt w:val="bullet"/>
+      <w:lvlText w:val="◦"/>
+      <w:lvlJc w:val="left"/>
+      <w:pPr>
+        <w:tabs>
+          <w:tab w:val="num" w:pos="3240"/>
+        </w:tabs>
+        <w:ind w:left="3240" w:hanging="360"/>
+      </w:pPr>
+      <w:rPr>
+        <w:rFonts w:ascii="OpenSymbol" w:hAnsi="OpenSymbol" w:cs="OpenSymbol" w:hint="default"/>
+      </w:rPr>
+    </w:lvl>
+    <w:lvl w:ilvl="8">
+      <w:start w:val="1"/>
+      <w:numFmt w:val="bullet"/>
+      <w:lvlText w:val="▪"/>
+      <w:lvlJc w:val="left"/>
+      <w:pPr>
+        <w:tabs>
+          <w:tab w:val="num" w:pos="3600"/>
+        </w:tabs>
+        <w:ind w:left="3600" w:hanging="360"/>
+      </w:pPr>
+      <w:rPr>
+        <w:rFonts w:ascii="OpenSymbol" w:hAnsi="OpenSymbol" w:cs="OpenSymbol" w:hint="default"/>
+      </w:rPr>
+    </w:lvl>
+  </w:abstractNum>
+  <w:abstractNum w:abstractNumId="4">
+    <w:lvl w:ilvl="0">
+      <w:start w:val="1"/>
       <w:numFmt w:val="none"/>
       <w:suff w:val="nothing"/>
       <w:lvlText w:val=""/>
@@ -2099,6 +2432,9 @@
   </w:num>
   <w:num w:numId="3">
     <w:abstractNumId w:val="3"/>
+  </w:num>
+  <w:num w:numId="4">
+    <w:abstractNumId w:val="4"/>
   </w:num>
 </w:numbering>
 </file>

</xml_diff>